<commit_message>
court(wisctapp): reply-brief date and signature one block, counsel spacing above each group (fb-595.54.46)
Co-Authored-By: Claude Opus 5.5 <noreply@anthropic.com>
</commit_message>
<xml_diff>
--- a/courts/seventh-circuit/wisconsin/state/court-of-appeals/reply-brief/usage/OUTPUT-reply-brief.docx
+++ b/courts/seventh-circuit/wisconsin/state/court-of-appeals/reply-brief/usage/OUTPUT-reply-brief.docx
@@ -3615,6 +3615,11 @@
           <w:tcPr>
             <w:tcW w:w="8640" w:type="dxa"/>
           </w:tcPr>
+          <w:p>
+            <w:pPr>
+              <w:spacing w:before="0" w:after="0" w:line="104" w:lineRule="exact"/>
+            </w:pPr>
+          </w:p>
           <w:tbl>
             <w:tblPr>
               <w:tblW w:w="8640" w:type="dxa"/>
@@ -4174,6 +4179,11 @@
           <w:tcPr>
             <w:tcW w:w="8640" w:type="dxa"/>
           </w:tcPr>
+          <w:p>
+            <w:pPr>
+              <w:spacing w:before="0" w:after="0" w:line="104" w:lineRule="exact"/>
+            </w:pPr>
+          </w:p>
           <w:tbl>
             <w:tblPr>
               <w:tblW w:w="8640" w:type="dxa"/>

</xml_diff>